<commit_message>
descripción del reto corregio
</commit_message>
<xml_diff>
--- a/project-ad2024/Reto AD 2024.docx
+++ b/project-ad2024/Reto AD 2024.docx
@@ -509,7 +509,6 @@
                                           <a:prstGeom prst="rect">
                                             <a:avLst/>
                                           </a:prstGeom>
-                                          <a:noFill/>
                                         </pic:spPr>
                                       </pic:pic>
                                     </a:graphicData>
@@ -632,7 +631,6 @@
                                     <a:prstGeom prst="rect">
                                       <a:avLst/>
                                     </a:prstGeom>
-                                    <a:noFill/>
                                   </pic:spPr>
                                 </pic:pic>
                               </a:graphicData>
@@ -931,6 +929,22 @@
       <w:pPr>
         <w:pStyle w:val="BodyText"/>
         <w:bidi w:val="0"/>
+        <w:jc w:val="both"/>
+        <w:rPr>
+          <w:rFonts w:ascii="Arial" w:hAnsi="Arial"/>
+        </w:rPr>
+      </w:pPr>
+      <w:r>
+        <w:rPr>
+          <w:rFonts w:ascii="Arial" w:hAnsi="Arial"/>
+        </w:rPr>
+        <w:t>(arriba, izquierda, abajo, derecha)</w:t>
+      </w:r>
+    </w:p>
+    <w:p>
+      <w:pPr>
+        <w:pStyle w:val="BodyText"/>
+        <w:bidi w:val="0"/>
         <w:spacing w:before="0" w:after="0"/>
         <w:jc w:val="both"/>
         <w:rPr>
@@ -941,7 +955,157 @@
         <w:rPr>
           <w:rFonts w:ascii="Courier New" w:hAnsi="Courier New"/>
         </w:rPr>
-        <w:t>1001 1000 1100 1001 1100 1001 1000 1100</w:t>
+        <w:t>1</w:t>
+      </w:r>
+      <w:r>
+        <w:rPr>
+          <w:rFonts w:ascii="Courier New" w:hAnsi="Courier New"/>
+        </w:rPr>
+        <w:t>1</w:t>
+      </w:r>
+      <w:r>
+        <w:rPr>
+          <w:rFonts w:ascii="Courier New" w:hAnsi="Courier New"/>
+        </w:rPr>
+        <w:t>0</w:t>
+      </w:r>
+      <w:r>
+        <w:rPr>
+          <w:rFonts w:ascii="Courier New" w:hAnsi="Courier New"/>
+        </w:rPr>
+        <w:t>0</w:t>
+      </w:r>
+      <w:r>
+        <w:rPr>
+          <w:rFonts w:ascii="Courier New" w:hAnsi="Courier New"/>
+        </w:rPr>
+        <w:t xml:space="preserve"> 1000 1</w:t>
+      </w:r>
+      <w:r>
+        <w:rPr>
+          <w:rFonts w:ascii="Courier New" w:hAnsi="Courier New"/>
+        </w:rPr>
+        <w:t>0</w:t>
+      </w:r>
+      <w:r>
+        <w:rPr>
+          <w:rFonts w:ascii="Courier New" w:hAnsi="Courier New"/>
+        </w:rPr>
+        <w:t>0</w:t>
+      </w:r>
+      <w:r>
+        <w:rPr>
+          <w:rFonts w:ascii="Courier New" w:hAnsi="Courier New"/>
+        </w:rPr>
+        <w:t>1</w:t>
+      </w:r>
+      <w:r>
+        <w:rPr>
+          <w:rFonts w:ascii="Courier New" w:hAnsi="Courier New"/>
+        </w:rPr>
+        <w:t xml:space="preserve"> 1</w:t>
+      </w:r>
+      <w:r>
+        <w:rPr>
+          <w:rFonts w:ascii="Courier New" w:hAnsi="Courier New"/>
+        </w:rPr>
+        <w:t>1</w:t>
+      </w:r>
+      <w:r>
+        <w:rPr>
+          <w:rFonts w:ascii="Courier New" w:hAnsi="Courier New"/>
+        </w:rPr>
+        <w:t>0</w:t>
+      </w:r>
+      <w:r>
+        <w:rPr>
+          <w:rFonts w:ascii="Courier New" w:hAnsi="Courier New"/>
+        </w:rPr>
+        <w:t>0</w:t>
+      </w:r>
+      <w:r>
+        <w:rPr>
+          <w:rFonts w:ascii="Courier New" w:hAnsi="Courier New"/>
+        </w:rPr>
+        <w:t xml:space="preserve"> 1</w:t>
+      </w:r>
+      <w:r>
+        <w:rPr>
+          <w:rFonts w:ascii="Courier New" w:hAnsi="Courier New"/>
+        </w:rPr>
+        <w:t>0</w:t>
+      </w:r>
+      <w:r>
+        <w:rPr>
+          <w:rFonts w:ascii="Courier New" w:hAnsi="Courier New"/>
+        </w:rPr>
+        <w:t>0</w:t>
+      </w:r>
+      <w:r>
+        <w:rPr>
+          <w:rFonts w:ascii="Courier New" w:hAnsi="Courier New"/>
+        </w:rPr>
+        <w:t>1</w:t>
+      </w:r>
+      <w:r>
+        <w:rPr>
+          <w:rFonts w:ascii="Courier New" w:hAnsi="Courier New"/>
+        </w:rPr>
+        <w:t xml:space="preserve"> 1</w:t>
+      </w:r>
+      <w:r>
+        <w:rPr>
+          <w:rFonts w:ascii="Courier New" w:hAnsi="Courier New"/>
+        </w:rPr>
+        <w:t>1</w:t>
+      </w:r>
+      <w:r>
+        <w:rPr>
+          <w:rFonts w:ascii="Courier New" w:hAnsi="Courier New"/>
+        </w:rPr>
+        <w:t>0</w:t>
+      </w:r>
+      <w:r>
+        <w:rPr>
+          <w:rFonts w:ascii="Courier New" w:hAnsi="Courier New"/>
+        </w:rPr>
+        <w:t>0</w:t>
+      </w:r>
+      <w:r>
+        <w:rPr>
+          <w:rFonts w:ascii="Courier New" w:hAnsi="Courier New"/>
+        </w:rPr>
+        <w:t xml:space="preserve"> 1</w:t>
+      </w:r>
+      <w:r>
+        <w:rPr>
+          <w:rFonts w:ascii="Courier New" w:hAnsi="Courier New"/>
+        </w:rPr>
+        <w:t>0</w:t>
+      </w:r>
+      <w:r>
+        <w:rPr>
+          <w:rFonts w:ascii="Courier New" w:hAnsi="Courier New"/>
+        </w:rPr>
+        <w:t>00 1</w:t>
+      </w:r>
+      <w:r>
+        <w:rPr>
+          <w:rFonts w:ascii="Courier New" w:hAnsi="Courier New"/>
+        </w:rPr>
+        <w:t>0</w:t>
+      </w:r>
+      <w:r>
+        <w:rPr>
+          <w:rFonts w:ascii="Courier New" w:hAnsi="Courier New"/>
+        </w:rPr>
+        <w:t>0</w:t>
+      </w:r>
+      <w:r>
+        <w:rPr>
+          <w:rFonts w:ascii="Courier New" w:hAnsi="Courier New"/>
+        </w:rPr>
+        <w:t>1</w:t>
       </w:r>
     </w:p>
     <w:p>
@@ -958,7 +1122,127 @@
         <w:rPr>
           <w:rFonts w:ascii="Courier New" w:hAnsi="Courier New"/>
         </w:rPr>
-        <w:t>0001 0000 0110 0011 0110 0011 0010 0110</w:t>
+        <w:t>0100</w:t>
+      </w:r>
+      <w:r>
+        <w:rPr>
+          <w:rFonts w:ascii="Courier New" w:hAnsi="Courier New"/>
+        </w:rPr>
+        <w:t xml:space="preserve"> 0000 0</w:t>
+      </w:r>
+      <w:r>
+        <w:rPr>
+          <w:rFonts w:ascii="Courier New" w:hAnsi="Courier New"/>
+        </w:rPr>
+        <w:t>0</w:t>
+      </w:r>
+      <w:r>
+        <w:rPr>
+          <w:rFonts w:ascii="Courier New" w:hAnsi="Courier New"/>
+        </w:rPr>
+        <w:t>1</w:t>
+      </w:r>
+      <w:r>
+        <w:rPr>
+          <w:rFonts w:ascii="Courier New" w:hAnsi="Courier New"/>
+        </w:rPr>
+        <w:t>1</w:t>
+      </w:r>
+      <w:r>
+        <w:rPr>
+          <w:rFonts w:ascii="Courier New" w:hAnsi="Courier New"/>
+        </w:rPr>
+        <w:t xml:space="preserve"> 0</w:t>
+      </w:r>
+      <w:r>
+        <w:rPr>
+          <w:rFonts w:ascii="Courier New" w:hAnsi="Courier New"/>
+        </w:rPr>
+        <w:t>1</w:t>
+      </w:r>
+      <w:r>
+        <w:rPr>
+          <w:rFonts w:ascii="Courier New" w:hAnsi="Courier New"/>
+        </w:rPr>
+        <w:t>1</w:t>
+      </w:r>
+      <w:r>
+        <w:rPr>
+          <w:rFonts w:ascii="Courier New" w:hAnsi="Courier New"/>
+        </w:rPr>
+        <w:t>0</w:t>
+      </w:r>
+      <w:r>
+        <w:rPr>
+          <w:rFonts w:ascii="Courier New" w:hAnsi="Courier New"/>
+        </w:rPr>
+        <w:t xml:space="preserve"> 0</w:t>
+      </w:r>
+      <w:r>
+        <w:rPr>
+          <w:rFonts w:ascii="Courier New" w:hAnsi="Courier New"/>
+        </w:rPr>
+        <w:t>0</w:t>
+      </w:r>
+      <w:r>
+        <w:rPr>
+          <w:rFonts w:ascii="Courier New" w:hAnsi="Courier New"/>
+        </w:rPr>
+        <w:t>1</w:t>
+      </w:r>
+      <w:r>
+        <w:rPr>
+          <w:rFonts w:ascii="Courier New" w:hAnsi="Courier New"/>
+        </w:rPr>
+        <w:t>1</w:t>
+      </w:r>
+      <w:r>
+        <w:rPr>
+          <w:rFonts w:ascii="Courier New" w:hAnsi="Courier New"/>
+        </w:rPr>
+        <w:t xml:space="preserve"> 0</w:t>
+      </w:r>
+      <w:r>
+        <w:rPr>
+          <w:rFonts w:ascii="Courier New" w:hAnsi="Courier New"/>
+        </w:rPr>
+        <w:t>1</w:t>
+      </w:r>
+      <w:r>
+        <w:rPr>
+          <w:rFonts w:ascii="Courier New" w:hAnsi="Courier New"/>
+        </w:rPr>
+        <w:t>1</w:t>
+      </w:r>
+      <w:r>
+        <w:rPr>
+          <w:rFonts w:ascii="Courier New" w:hAnsi="Courier New"/>
+        </w:rPr>
+        <w:t>0</w:t>
+      </w:r>
+      <w:r>
+        <w:rPr>
+          <w:rFonts w:ascii="Courier New" w:hAnsi="Courier New"/>
+        </w:rPr>
+        <w:t xml:space="preserve"> 0010 0</w:t>
+      </w:r>
+      <w:r>
+        <w:rPr>
+          <w:rFonts w:ascii="Courier New" w:hAnsi="Courier New"/>
+        </w:rPr>
+        <w:t>0</w:t>
+      </w:r>
+      <w:r>
+        <w:rPr>
+          <w:rFonts w:ascii="Courier New" w:hAnsi="Courier New"/>
+        </w:rPr>
+        <w:t>1</w:t>
+      </w:r>
+      <w:r>
+        <w:rPr>
+          <w:rFonts w:ascii="Courier New" w:hAnsi="Courier New"/>
+        </w:rPr>
+        <w:t>1</w:t>
       </w:r>
     </w:p>
     <w:p>
@@ -975,7 +1259,127 @@
         <w:rPr>
           <w:rFonts w:ascii="Courier New" w:hAnsi="Courier New"/>
         </w:rPr>
-        <w:t>1000 0100 1001 1000 1000 1100 1001 1100</w:t>
+        <w:t>01</w:t>
+      </w:r>
+      <w:r>
+        <w:rPr>
+          <w:rFonts w:ascii="Courier New" w:hAnsi="Courier New"/>
+        </w:rPr>
+        <w:t>00 0</w:t>
+      </w:r>
+      <w:r>
+        <w:rPr>
+          <w:rFonts w:ascii="Courier New" w:hAnsi="Courier New"/>
+        </w:rPr>
+        <w:t>0</w:t>
+      </w:r>
+      <w:r>
+        <w:rPr>
+          <w:rFonts w:ascii="Courier New" w:hAnsi="Courier New"/>
+        </w:rPr>
+        <w:t>0</w:t>
+      </w:r>
+      <w:r>
+        <w:rPr>
+          <w:rFonts w:ascii="Courier New" w:hAnsi="Courier New"/>
+        </w:rPr>
+        <w:t>1</w:t>
+      </w:r>
+      <w:r>
+        <w:rPr>
+          <w:rFonts w:ascii="Courier New" w:hAnsi="Courier New"/>
+        </w:rPr>
+        <w:t xml:space="preserve"> 1</w:t>
+      </w:r>
+      <w:r>
+        <w:rPr>
+          <w:rFonts w:ascii="Courier New" w:hAnsi="Courier New"/>
+        </w:rPr>
+        <w:t>1</w:t>
+      </w:r>
+      <w:r>
+        <w:rPr>
+          <w:rFonts w:ascii="Courier New" w:hAnsi="Courier New"/>
+        </w:rPr>
+        <w:t>0</w:t>
+      </w:r>
+      <w:r>
+        <w:rPr>
+          <w:rFonts w:ascii="Courier New" w:hAnsi="Courier New"/>
+        </w:rPr>
+        <w:t>0</w:t>
+      </w:r>
+      <w:r>
+        <w:rPr>
+          <w:rFonts w:ascii="Courier New" w:hAnsi="Courier New"/>
+        </w:rPr>
+        <w:t xml:space="preserve"> 1000 1000 1</w:t>
+      </w:r>
+      <w:r>
+        <w:rPr>
+          <w:rFonts w:ascii="Courier New" w:hAnsi="Courier New"/>
+        </w:rPr>
+        <w:t>0</w:t>
+      </w:r>
+      <w:r>
+        <w:rPr>
+          <w:rFonts w:ascii="Courier New" w:hAnsi="Courier New"/>
+        </w:rPr>
+        <w:t>0</w:t>
+      </w:r>
+      <w:r>
+        <w:rPr>
+          <w:rFonts w:ascii="Courier New" w:hAnsi="Courier New"/>
+        </w:rPr>
+        <w:t>1</w:t>
+      </w:r>
+      <w:r>
+        <w:rPr>
+          <w:rFonts w:ascii="Courier New" w:hAnsi="Courier New"/>
+        </w:rPr>
+        <w:t xml:space="preserve"> 1</w:t>
+      </w:r>
+      <w:r>
+        <w:rPr>
+          <w:rFonts w:ascii="Courier New" w:hAnsi="Courier New"/>
+        </w:rPr>
+        <w:t>1</w:t>
+      </w:r>
+      <w:r>
+        <w:rPr>
+          <w:rFonts w:ascii="Courier New" w:hAnsi="Courier New"/>
+        </w:rPr>
+        <w:t>0</w:t>
+      </w:r>
+      <w:r>
+        <w:rPr>
+          <w:rFonts w:ascii="Courier New" w:hAnsi="Courier New"/>
+        </w:rPr>
+        <w:t>0</w:t>
+      </w:r>
+      <w:r>
+        <w:rPr>
+          <w:rFonts w:ascii="Courier New" w:hAnsi="Courier New"/>
+        </w:rPr>
+        <w:t xml:space="preserve"> 1</w:t>
+      </w:r>
+      <w:r>
+        <w:rPr>
+          <w:rFonts w:ascii="Courier New" w:hAnsi="Courier New"/>
+        </w:rPr>
+        <w:t>0</w:t>
+      </w:r>
+      <w:r>
+        <w:rPr>
+          <w:rFonts w:ascii="Courier New" w:hAnsi="Courier New"/>
+        </w:rPr>
+        <w:t>0</w:t>
+      </w:r>
+      <w:r>
+        <w:rPr>
+          <w:rFonts w:ascii="Courier New" w:hAnsi="Courier New"/>
+        </w:rPr>
+        <w:t>1</w:t>
       </w:r>
     </w:p>
     <w:p>
@@ -992,7 +1396,133 @@
         <w:rPr>
           <w:rFonts w:ascii="Courier New" w:hAnsi="Courier New"/>
         </w:rPr>
-        <w:t>0011 0110 0011 0010 0010 0110 0011 0110</w:t>
+        <w:t>0</w:t>
+      </w:r>
+      <w:r>
+        <w:rPr>
+          <w:rFonts w:ascii="Courier New" w:hAnsi="Courier New"/>
+        </w:rPr>
+        <w:t>110</w:t>
+      </w:r>
+      <w:r>
+        <w:rPr>
+          <w:rFonts w:ascii="Courier New" w:hAnsi="Courier New"/>
+        </w:rPr>
+        <w:t xml:space="preserve"> 0</w:t>
+      </w:r>
+      <w:r>
+        <w:rPr>
+          <w:rFonts w:ascii="Courier New" w:hAnsi="Courier New"/>
+        </w:rPr>
+        <w:t>0</w:t>
+      </w:r>
+      <w:r>
+        <w:rPr>
+          <w:rFonts w:ascii="Courier New" w:hAnsi="Courier New"/>
+        </w:rPr>
+        <w:t>1</w:t>
+      </w:r>
+      <w:r>
+        <w:rPr>
+          <w:rFonts w:ascii="Courier New" w:hAnsi="Courier New"/>
+        </w:rPr>
+        <w:t>1</w:t>
+      </w:r>
+      <w:r>
+        <w:rPr>
+          <w:rFonts w:ascii="Courier New" w:hAnsi="Courier New"/>
+        </w:rPr>
+        <w:t xml:space="preserve"> 0</w:t>
+      </w:r>
+      <w:r>
+        <w:rPr>
+          <w:rFonts w:ascii="Courier New" w:hAnsi="Courier New"/>
+        </w:rPr>
+        <w:t>1</w:t>
+      </w:r>
+      <w:r>
+        <w:rPr>
+          <w:rFonts w:ascii="Courier New" w:hAnsi="Courier New"/>
+        </w:rPr>
+        <w:t>1</w:t>
+      </w:r>
+      <w:r>
+        <w:rPr>
+          <w:rFonts w:ascii="Courier New" w:hAnsi="Courier New"/>
+        </w:rPr>
+        <w:t>0</w:t>
+      </w:r>
+      <w:r>
+        <w:rPr>
+          <w:rFonts w:ascii="Courier New" w:hAnsi="Courier New"/>
+        </w:rPr>
+        <w:t xml:space="preserve"> 0010 0010 0</w:t>
+      </w:r>
+      <w:r>
+        <w:rPr>
+          <w:rFonts w:ascii="Courier New" w:hAnsi="Courier New"/>
+        </w:rPr>
+        <w:t>0</w:t>
+      </w:r>
+      <w:r>
+        <w:rPr>
+          <w:rFonts w:ascii="Courier New" w:hAnsi="Courier New"/>
+        </w:rPr>
+        <w:t>1</w:t>
+      </w:r>
+      <w:r>
+        <w:rPr>
+          <w:rFonts w:ascii="Courier New" w:hAnsi="Courier New"/>
+        </w:rPr>
+        <w:t>1</w:t>
+      </w:r>
+      <w:r>
+        <w:rPr>
+          <w:rFonts w:ascii="Courier New" w:hAnsi="Courier New"/>
+        </w:rPr>
+        <w:t xml:space="preserve"> 0</w:t>
+      </w:r>
+      <w:r>
+        <w:rPr>
+          <w:rFonts w:ascii="Courier New" w:hAnsi="Courier New"/>
+        </w:rPr>
+        <w:t>1</w:t>
+      </w:r>
+      <w:r>
+        <w:rPr>
+          <w:rFonts w:ascii="Courier New" w:hAnsi="Courier New"/>
+        </w:rPr>
+        <w:t>1</w:t>
+      </w:r>
+      <w:r>
+        <w:rPr>
+          <w:rFonts w:ascii="Courier New" w:hAnsi="Courier New"/>
+        </w:rPr>
+        <w:t>0</w:t>
+      </w:r>
+      <w:r>
+        <w:rPr>
+          <w:rFonts w:ascii="Courier New" w:hAnsi="Courier New"/>
+        </w:rPr>
+        <w:t xml:space="preserve"> 0</w:t>
+      </w:r>
+      <w:r>
+        <w:rPr>
+          <w:rFonts w:ascii="Courier New" w:hAnsi="Courier New"/>
+        </w:rPr>
+        <w:t>0</w:t>
+      </w:r>
+      <w:r>
+        <w:rPr>
+          <w:rFonts w:ascii="Courier New" w:hAnsi="Courier New"/>
+        </w:rPr>
+        <w:t>1</w:t>
+      </w:r>
+      <w:r>
+        <w:rPr>
+          <w:rFonts w:ascii="Courier New" w:hAnsi="Courier New"/>
+        </w:rPr>
+        <w:t>1</w:t>
       </w:r>
     </w:p>
     <w:p>
@@ -1009,7 +1539,103 @@
         <w:rPr>
           <w:rFonts w:ascii="Courier New" w:hAnsi="Courier New"/>
         </w:rPr>
-        <w:t>1001 1000 1000 1000 1100 1001 1100 1101</w:t>
+        <w:t>1</w:t>
+      </w:r>
+      <w:r>
+        <w:rPr>
+          <w:rFonts w:ascii="Courier New" w:hAnsi="Courier New"/>
+        </w:rPr>
+        <w:t>1</w:t>
+      </w:r>
+      <w:r>
+        <w:rPr>
+          <w:rFonts w:ascii="Courier New" w:hAnsi="Courier New"/>
+        </w:rPr>
+        <w:t>0</w:t>
+      </w:r>
+      <w:r>
+        <w:rPr>
+          <w:rFonts w:ascii="Courier New" w:hAnsi="Courier New"/>
+        </w:rPr>
+        <w:t>0</w:t>
+      </w:r>
+      <w:r>
+        <w:rPr>
+          <w:rFonts w:ascii="Courier New" w:hAnsi="Courier New"/>
+        </w:rPr>
+        <w:t xml:space="preserve"> 1000 1000 1000 1</w:t>
+      </w:r>
+      <w:r>
+        <w:rPr>
+          <w:rFonts w:ascii="Courier New" w:hAnsi="Courier New"/>
+        </w:rPr>
+        <w:t>0</w:t>
+      </w:r>
+      <w:r>
+        <w:rPr>
+          <w:rFonts w:ascii="Courier New" w:hAnsi="Courier New"/>
+        </w:rPr>
+        <w:t>0</w:t>
+      </w:r>
+      <w:r>
+        <w:rPr>
+          <w:rFonts w:ascii="Courier New" w:hAnsi="Courier New"/>
+        </w:rPr>
+        <w:t>1</w:t>
+      </w:r>
+      <w:r>
+        <w:rPr>
+          <w:rFonts w:ascii="Courier New" w:hAnsi="Courier New"/>
+        </w:rPr>
+        <w:t xml:space="preserve"> 1</w:t>
+      </w:r>
+      <w:r>
+        <w:rPr>
+          <w:rFonts w:ascii="Courier New" w:hAnsi="Courier New"/>
+        </w:rPr>
+        <w:t>1</w:t>
+      </w:r>
+      <w:r>
+        <w:rPr>
+          <w:rFonts w:ascii="Courier New" w:hAnsi="Courier New"/>
+        </w:rPr>
+        <w:t>0</w:t>
+      </w:r>
+      <w:r>
+        <w:rPr>
+          <w:rFonts w:ascii="Courier New" w:hAnsi="Courier New"/>
+        </w:rPr>
+        <w:t>0</w:t>
+      </w:r>
+      <w:r>
+        <w:rPr>
+          <w:rFonts w:ascii="Courier New" w:hAnsi="Courier New"/>
+        </w:rPr>
+        <w:t xml:space="preserve"> 1</w:t>
+      </w:r>
+      <w:r>
+        <w:rPr>
+          <w:rFonts w:ascii="Courier New" w:hAnsi="Courier New"/>
+        </w:rPr>
+        <w:t>0</w:t>
+      </w:r>
+      <w:r>
+        <w:rPr>
+          <w:rFonts w:ascii="Courier New" w:hAnsi="Courier New"/>
+        </w:rPr>
+        <w:t>0</w:t>
+      </w:r>
+      <w:r>
+        <w:rPr>
+          <w:rFonts w:ascii="Courier New" w:hAnsi="Courier New"/>
+        </w:rPr>
+        <w:t>1</w:t>
+      </w:r>
+      <w:r>
+        <w:rPr>
+          <w:rFonts w:ascii="Courier New" w:hAnsi="Courier New"/>
+        </w:rPr>
+        <w:t xml:space="preserve"> 1101</w:t>
       </w:r>
     </w:p>
     <w:p>
@@ -1026,7 +1652,103 @@
         <w:rPr>
           <w:rFonts w:ascii="Courier New" w:hAnsi="Courier New"/>
         </w:rPr>
-        <w:t>0011 0010 0010 0010 0110 0011 0110 0111</w:t>
+        <w:t>0</w:t>
+      </w:r>
+      <w:r>
+        <w:rPr>
+          <w:rFonts w:ascii="Courier New" w:hAnsi="Courier New"/>
+        </w:rPr>
+        <w:t>1</w:t>
+      </w:r>
+      <w:r>
+        <w:rPr>
+          <w:rFonts w:ascii="Courier New" w:hAnsi="Courier New"/>
+        </w:rPr>
+        <w:t>1</w:t>
+      </w:r>
+      <w:r>
+        <w:rPr>
+          <w:rFonts w:ascii="Courier New" w:hAnsi="Courier New"/>
+        </w:rPr>
+        <w:t>0</w:t>
+      </w:r>
+      <w:r>
+        <w:rPr>
+          <w:rFonts w:ascii="Courier New" w:hAnsi="Courier New"/>
+        </w:rPr>
+        <w:t xml:space="preserve"> 0010 0010 0010 0</w:t>
+      </w:r>
+      <w:r>
+        <w:rPr>
+          <w:rFonts w:ascii="Courier New" w:hAnsi="Courier New"/>
+        </w:rPr>
+        <w:t>0</w:t>
+      </w:r>
+      <w:r>
+        <w:rPr>
+          <w:rFonts w:ascii="Courier New" w:hAnsi="Courier New"/>
+        </w:rPr>
+        <w:t>1</w:t>
+      </w:r>
+      <w:r>
+        <w:rPr>
+          <w:rFonts w:ascii="Courier New" w:hAnsi="Courier New"/>
+        </w:rPr>
+        <w:t>1</w:t>
+      </w:r>
+      <w:r>
+        <w:rPr>
+          <w:rFonts w:ascii="Courier New" w:hAnsi="Courier New"/>
+        </w:rPr>
+        <w:t xml:space="preserve"> 0</w:t>
+      </w:r>
+      <w:r>
+        <w:rPr>
+          <w:rFonts w:ascii="Courier New" w:hAnsi="Courier New"/>
+        </w:rPr>
+        <w:t>1</w:t>
+      </w:r>
+      <w:r>
+        <w:rPr>
+          <w:rFonts w:ascii="Courier New" w:hAnsi="Courier New"/>
+        </w:rPr>
+        <w:t>1</w:t>
+      </w:r>
+      <w:r>
+        <w:rPr>
+          <w:rFonts w:ascii="Courier New" w:hAnsi="Courier New"/>
+        </w:rPr>
+        <w:t>0</w:t>
+      </w:r>
+      <w:r>
+        <w:rPr>
+          <w:rFonts w:ascii="Courier New" w:hAnsi="Courier New"/>
+        </w:rPr>
+        <w:t xml:space="preserve"> 0</w:t>
+      </w:r>
+      <w:r>
+        <w:rPr>
+          <w:rFonts w:ascii="Courier New" w:hAnsi="Courier New"/>
+        </w:rPr>
+        <w:t>0</w:t>
+      </w:r>
+      <w:r>
+        <w:rPr>
+          <w:rFonts w:ascii="Courier New" w:hAnsi="Courier New"/>
+        </w:rPr>
+        <w:t>1</w:t>
+      </w:r>
+      <w:r>
+        <w:rPr>
+          <w:rFonts w:ascii="Courier New" w:hAnsi="Courier New"/>
+        </w:rPr>
+        <w:t>1</w:t>
+      </w:r>
+      <w:r>
+        <w:rPr>
+          <w:rFonts w:ascii="Courier New" w:hAnsi="Courier New"/>
+        </w:rPr>
+        <w:t xml:space="preserve"> 0111</w:t>
       </w:r>
     </w:p>
     <w:p>
@@ -1366,7 +2088,25 @@
         <w:rPr>
           <w:rFonts w:ascii="Courier New" w:hAnsi="Courier New"/>
         </w:rPr>
-        <w:t>8 5 8 6</w:t>
+        <w:t>6</w:t>
+      </w:r>
+      <w:r>
+        <w:rPr>
+          <w:rFonts w:ascii="Courier New" w:hAnsi="Courier New"/>
+        </w:rPr>
+        <w:t xml:space="preserve"> 5 </w:t>
+      </w:r>
+      <w:r>
+        <w:rPr>
+          <w:rFonts w:ascii="Courier New" w:hAnsi="Courier New"/>
+        </w:rPr>
+        <w:t>6</w:t>
+      </w:r>
+      <w:r>
+        <w:rPr>
+          <w:rFonts w:ascii="Courier New" w:hAnsi="Courier New"/>
+        </w:rPr>
+        <w:t xml:space="preserve"> 6</w:t>
       </w:r>
     </w:p>
     <w:p>
@@ -1383,7 +2123,25 @@
         <w:rPr>
           <w:rFonts w:ascii="Courier New" w:hAnsi="Courier New"/>
         </w:rPr>
-        <w:t>8 7 8 8</w:t>
+        <w:t>6</w:t>
+      </w:r>
+      <w:r>
+        <w:rPr>
+          <w:rFonts w:ascii="Courier New" w:hAnsi="Courier New"/>
+        </w:rPr>
+        <w:t xml:space="preserve"> 7 </w:t>
+      </w:r>
+      <w:r>
+        <w:rPr>
+          <w:rFonts w:ascii="Courier New" w:hAnsi="Courier New"/>
+        </w:rPr>
+        <w:t>6</w:t>
+      </w:r>
+      <w:r>
+        <w:rPr>
+          <w:rFonts w:ascii="Courier New" w:hAnsi="Courier New"/>
+        </w:rPr>
+        <w:t xml:space="preserve"> 8</w:t>
       </w:r>
     </w:p>
     <w:p>
@@ -1875,7 +2633,7 @@
         <w:pStyle w:val="Normal"/>
         <w:numPr>
           <w:ilvl w:val="0"/>
-          <w:numId w:val="6"/>
+          <w:numId w:val="5"/>
         </w:numPr>
         <w:bidi w:val="0"/>
         <w:jc w:val="both"/>
@@ -1889,15 +2647,7 @@
           <w:b/>
           <w:bCs/>
         </w:rPr>
-        <w:t>R</w:t>
-      </w:r>
-      <w:r>
-        <w:rPr>
-          <w:rFonts w:ascii="Arial" w:hAnsi="Arial"/>
-          <w:b/>
-          <w:bCs/>
-        </w:rPr>
-        <w:t>endimiento</w:t>
+        <w:t>Rendimiento</w:t>
       </w:r>
       <w:r>
         <w:rPr>
@@ -1911,7 +2661,7 @@
         <w:pStyle w:val="BodyText"/>
         <w:numPr>
           <w:ilvl w:val="0"/>
-          <w:numId w:val="6"/>
+          <w:numId w:val="5"/>
         </w:numPr>
         <w:bidi w:val="0"/>
         <w:spacing w:before="0" w:after="140"/>
@@ -1925,14 +2675,7 @@
           <w:rStyle w:val="Strong"/>
           <w:rFonts w:ascii="Arial" w:hAnsi="Arial"/>
         </w:rPr>
-        <w:t>I</w:t>
-      </w:r>
-      <w:r>
-        <w:rPr>
-          <w:rStyle w:val="Strong"/>
-          <w:rFonts w:ascii="Arial" w:hAnsi="Arial"/>
-        </w:rPr>
-        <w:t>nnovación</w:t>
+        <w:t>Innovación</w:t>
       </w:r>
       <w:r>
         <w:rPr>
@@ -1961,6 +2704,11 @@
 <w:footnotes xmlns:o="urn:schemas-microsoft-com:office:office" xmlns:r="http://schemas.openxmlformats.org/officeDocument/2006/relationships" xmlns:v="urn:schemas-microsoft-com:vml" xmlns:w="http://schemas.openxmlformats.org/wordprocessingml/2006/main" xmlns:w10="urn:schemas-microsoft-com:office:word" xmlns:wp="http://schemas.openxmlformats.org/drawingml/2006/wordprocessingDrawing" xmlns:wps="http://schemas.microsoft.com/office/word/2010/wordprocessingShape" xmlns:wpg="http://schemas.microsoft.com/office/word/2010/wordprocessingGroup" xmlns:mc="http://schemas.openxmlformats.org/markup-compatibility/2006" xmlns:wp14="http://schemas.microsoft.com/office/word/2010/wordprocessingDrawing" xmlns:w14="http://schemas.microsoft.com/office/word/2010/wordml" xmlns:w15="http://schemas.microsoft.com/office/word/2012/wordml" mc:Ignorable="w14 wp14 w15">
   <w:footnote w:id="0" w:type="separator">
     <w:p>
+      <w:pPr>
+        <w:rPr>
+          <w:sz w:val="12"/>
+        </w:rPr>
+      </w:pPr>
       <w:r>
         <w:separator/>
       </w:r>
@@ -1968,6 +2716,11 @@
   </w:footnote>
   <w:footnote w:id="1" w:type="continuationSeparator">
     <w:p>
+      <w:pPr>
+        <w:rPr>
+          <w:sz w:val="12"/>
+        </w:rPr>
+      </w:pPr>
       <w:r>
         <w:continuationSeparator/>
       </w:r>
@@ -3001,7 +3754,7 @@
     </w:rPr>
   </w:style>
   <w:style w:type="paragraph" w:styleId="Heading1">
-    <w:name w:val="heading 1"/>
+    <w:name w:val="Heading 1"/>
     <w:basedOn w:val="Ttulo"/>
     <w:next w:val="BodyText"/>
     <w:qFormat/>
@@ -3021,7 +3774,7 @@
     </w:rPr>
   </w:style>
   <w:style w:type="paragraph" w:styleId="Heading2">
-    <w:name w:val="heading 2"/>
+    <w:name w:val="Heading 2"/>
     <w:basedOn w:val="Ttulo"/>
     <w:next w:val="BodyText"/>
     <w:qFormat/>
@@ -3061,13 +3814,20 @@
     </w:rPr>
   </w:style>
   <w:style w:type="character" w:styleId="FootnoteReference">
-    <w:name w:val="footnote reference"/>
+    <w:name w:val="Footnote Reference"/>
     <w:rPr>
       <w:vertAlign w:val="superscript"/>
     </w:rPr>
   </w:style>
   <w:style w:type="character" w:styleId="FootnoteCharacters">
     <w:name w:val="Footnote Characters"/>
+    <w:qFormat/>
+    <w:rPr>
+      <w:vertAlign w:val="superscript"/>
+    </w:rPr>
+  </w:style>
+  <w:style w:type="character" w:styleId="FootnoteCharacters1">
+    <w:name w:val="Footnote Characters1"/>
     <w:qFormat/>
     <w:rPr>
       <w:vertAlign w:val="superscript"/>
@@ -3088,13 +3848,20 @@
     </w:rPr>
   </w:style>
   <w:style w:type="character" w:styleId="EndnoteReference">
-    <w:name w:val="endnote reference"/>
+    <w:name w:val="Endnote Reference"/>
     <w:rPr>
       <w:vertAlign w:val="superscript"/>
     </w:rPr>
   </w:style>
   <w:style w:type="character" w:styleId="EndnoteCharacters">
     <w:name w:val="Endnote Characters"/>
+    <w:qFormat/>
+    <w:rPr>
+      <w:vertAlign w:val="superscript"/>
+    </w:rPr>
+  </w:style>
+  <w:style w:type="character" w:styleId="EndnoteCharacters1">
+    <w:name w:val="Endnote Characters1"/>
     <w:qFormat/>
     <w:rPr>
       <w:vertAlign w:val="superscript"/>
@@ -3121,8 +3888,9 @@
       <w:u w:val="single"/>
     </w:rPr>
   </w:style>
-  <w:style w:type="character" w:styleId="Hyperlink">
-    <w:name w:val="Hyperlink"/>
+  <w:style w:type="character" w:styleId="InternetLink3">
+    <w:name w:val="Internet Link3"/>
+    <w:qFormat/>
     <w:rPr>
       <w:color w:val="000080"/>
       <w:u w:val="single"/>
@@ -3134,6 +3902,13 @@
     <w:rPr>
       <w:b/>
       <w:bCs/>
+    </w:rPr>
+  </w:style>
+  <w:style w:type="character" w:styleId="Hyperlink">
+    <w:name w:val="Hyperlink"/>
+    <w:rPr>
+      <w:color w:val="000080"/>
+      <w:u w:val="single"/>
     </w:rPr>
   </w:style>
   <w:style w:type="paragraph" w:styleId="Ttulo">
@@ -3168,7 +3943,7 @@
     </w:rPr>
   </w:style>
   <w:style w:type="paragraph" w:styleId="Caption">
-    <w:name w:val="caption"/>
+    <w:name w:val="Caption"/>
     <w:basedOn w:val="Normal"/>
     <w:qFormat/>
     <w:pPr>
@@ -3195,7 +3970,7 @@
     </w:rPr>
   </w:style>
   <w:style w:type="paragraph" w:styleId="IndexHeading">
-    <w:name w:val="index heading"/>
+    <w:name w:val="Index Heading"/>
     <w:basedOn w:val="Ttulo"/>
     <w:pPr>
       <w:suppressLineNumbers/>
@@ -3224,7 +3999,7 @@
     </w:rPr>
   </w:style>
   <w:style w:type="paragraph" w:styleId="TOC1">
-    <w:name w:val="toc 1"/>
+    <w:name w:val="TOC 1"/>
     <w:basedOn w:val="ndice"/>
     <w:pPr>
       <w:tabs>
@@ -3236,7 +4011,7 @@
     <w:rPr/>
   </w:style>
   <w:style w:type="paragraph" w:styleId="FootnoteText">
-    <w:name w:val="footnote text"/>
+    <w:name w:val="Footnote Text"/>
     <w:basedOn w:val="Normal"/>
     <w:pPr>
       <w:suppressLineNumbers/>
@@ -3262,7 +4037,7 @@
     <w:rPr/>
   </w:style>
   <w:style w:type="paragraph" w:styleId="TOC2">
-    <w:name w:val="toc 2"/>
+    <w:name w:val="TOC 2"/>
     <w:basedOn w:val="ndice"/>
     <w:pPr>
       <w:tabs>

</xml_diff>